<commit_message>
docs: embed git graph screenshot into submission reports
</commit_message>
<xml_diff>
--- a/docs/lab-01/LAB1_SUBMISSION_REPORT_READY.docx
+++ b/docs/lab-01/LAB1_SUBMISSION_REPORT_READY.docx
@@ -458,7 +458,6 @@
       <w:r>
         <w:rPr>
           <w:rFonts w:ascii="Consolas" w:hAnsi="Consolas"/>
-          <w:color w:val="1E293B"/>
           <w:sz w:val="17"/>
         </w:rPr>
         <w:t>*   c03027e Merge pull request #9 from natthakamol1130/lab1-staging</w:t>
@@ -508,59 +507,46 @@
         <w:t>* 101f877 Initial commit</w:t>
       </w:r>
     </w:p>
-    <w:tbl>
-      <w:tblPr>
-        <w:tblW w:type="auto" w:w="0"/>
+    <w:p>
+      <w:pPr>
+        <w:spacing w:before="120" w:after="160"/>
         <w:jc w:val="center"/>
-        <w:tblLayout w:type="fixed"/>
-        <w:tblLook w:firstColumn="1" w:firstRow="1" w:lastColumn="0" w:lastRow="0" w:noHBand="0" w:noVBand="1" w:val="04A0"/>
-      </w:tblPr>
-      <w:tblGrid>
-        <w:gridCol w:w="9936"/>
-      </w:tblGrid>
-      <w:tr>
-        <w:tc>
-          <w:tcPr>
-            <w:tcW w:type="dxa" w:w="9360"/>
-            <w:shd w:fill="F8FAFC"/>
-            <w:tcMar>
-              <w:top w:w="240" w:type="dxa"/>
-              <w:bottom w:w="240" w:type="dxa"/>
-              <w:left w:w="200" w:type="dxa"/>
-              <w:right w:w="200" w:type="dxa"/>
-            </w:tcMar>
-            <w:tcBorders>
-              <w:top w:val="dashed" w:sz="12" w:space="0" w:color="94A3B8"/>
-              <w:left w:val="dashed" w:sz="12" w:space="0" w:color="94A3B8"/>
-              <w:bottom w:val="dashed" w:sz="12" w:space="0" w:color="94A3B8"/>
-              <w:right w:val="dashed" w:sz="12" w:space="0" w:color="94A3B8"/>
-            </w:tcBorders>
-          </w:tcPr>
-          <w:p>
-            <w:pPr>
-              <w:spacing w:before="160" w:after="160"/>
-              <w:jc w:val="center"/>
-            </w:pPr>
-            <w:r>
-              <w:rPr>
-                <w:sz w:val="28"/>
-              </w:rPr>
-              <w:t xml:space="preserve">📷 </w:t>
-            </w:r>
-            <w:r>
-              <w:rPr>
-                <w:rFonts w:ascii="Sarabun" w:hAnsi="Sarabun"/>
-                <w:b/>
-                <w:color w:val="64748B"/>
-                <w:sz w:val="20"/>
-              </w:rPr>
-              <w:t>[ แนบภาพ Screenshot: Terminal แสดงคำสั่ง git log --oneline --graph -n 25 บน branch main ]</w:t>
-            </w:r>
-          </w:p>
-        </w:tc>
-      </w:tr>
-    </w:tbl>
-    <w:p/>
+      </w:pPr>
+      <w:r>
+        <w:drawing>
+          <wp:inline xmlns:a="http://schemas.openxmlformats.org/drawingml/2006/main" xmlns:pic="http://schemas.openxmlformats.org/drawingml/2006/picture">
+            <wp:extent cx="5943600" cy="3958530"/>
+            <wp:docPr id="2" name="Picture 2"/>
+            <wp:cNvGraphicFramePr>
+              <a:graphicFrameLocks noChangeAspect="1"/>
+            </wp:cNvGraphicFramePr>
+            <a:graphic>
+              <a:graphicData uri="http://schemas.openxmlformats.org/drawingml/2006/picture">
+                <pic:pic>
+                  <pic:nvPicPr>
+                    <pic:cNvPr id="0" name="git_log_graph.png"/>
+                    <pic:cNvPicPr/>
+                  </pic:nvPicPr>
+                  <pic:blipFill>
+                    <a:blip r:embed="rId10"/>
+                    <a:stretch>
+                      <a:fillRect/>
+                    </a:stretch>
+                  </pic:blipFill>
+                  <pic:spPr>
+                    <a:xfrm>
+                      <a:off x="0" y="0"/>
+                      <a:ext cx="5943600" cy="3958530"/>
+                    </a:xfrm>
+                    <a:prstGeom prst="rect"/>
+                  </pic:spPr>
+                </pic:pic>
+              </a:graphicData>
+            </a:graphic>
+          </wp:inline>
+        </w:drawing>
+      </w:r>
+    </w:p>
     <w:p>
       <w:r>
         <w:rPr>

</xml_diff>

<commit_message>
docs: embed directory structure screenshot into submission reports
</commit_message>
<xml_diff>
--- a/docs/lab-01/LAB1_SUBMISSION_REPORT_READY.docx
+++ b/docs/lab-01/LAB1_SUBMISSION_REPORT_READY.docx
@@ -555,59 +555,46 @@
         <w:t>4. Repository Directory Structure Evidence</w:t>
       </w:r>
     </w:p>
-    <w:tbl>
-      <w:tblPr>
-        <w:tblW w:type="auto" w:w="0"/>
+    <w:p>
+      <w:pPr>
+        <w:spacing w:before="120" w:after="160"/>
         <w:jc w:val="center"/>
-        <w:tblLayout w:type="fixed"/>
-        <w:tblLook w:firstColumn="1" w:firstRow="1" w:lastColumn="0" w:lastRow="0" w:noHBand="0" w:noVBand="1" w:val="04A0"/>
-      </w:tblPr>
-      <w:tblGrid>
-        <w:gridCol w:w="9936"/>
-      </w:tblGrid>
-      <w:tr>
-        <w:tc>
-          <w:tcPr>
-            <w:tcW w:type="dxa" w:w="9360"/>
-            <w:shd w:fill="F8FAFC"/>
-            <w:tcMar>
-              <w:top w:w="240" w:type="dxa"/>
-              <w:bottom w:w="240" w:type="dxa"/>
-              <w:left w:w="200" w:type="dxa"/>
-              <w:right w:w="200" w:type="dxa"/>
-            </w:tcMar>
-            <w:tcBorders>
-              <w:top w:val="dashed" w:sz="12" w:space="0" w:color="94A3B8"/>
-              <w:left w:val="dashed" w:sz="12" w:space="0" w:color="94A3B8"/>
-              <w:bottom w:val="dashed" w:sz="12" w:space="0" w:color="94A3B8"/>
-              <w:right w:val="dashed" w:sz="12" w:space="0" w:color="94A3B8"/>
-            </w:tcBorders>
-          </w:tcPr>
-          <w:p>
-            <w:pPr>
-              <w:spacing w:before="160" w:after="160"/>
-              <w:jc w:val="center"/>
-            </w:pPr>
-            <w:r>
-              <w:rPr>
-                <w:sz w:val="28"/>
-              </w:rPr>
-              <w:t xml:space="preserve">📷 </w:t>
-            </w:r>
-            <w:r>
-              <w:rPr>
-                <w:rFonts w:ascii="Sarabun" w:hAnsi="Sarabun"/>
-                <w:b/>
-                <w:color w:val="64748B"/>
-                <w:sz w:val="20"/>
-              </w:rPr>
-              <w:t>[ แนบภาพ Screenshot: แถบ Explorer ของ VS Code/IDE แสดงโครงสร้าง Directory ที่ครบถ้วน ]</w:t>
-            </w:r>
-          </w:p>
-        </w:tc>
-      </w:tr>
-    </w:tbl>
-    <w:p/>
+      </w:pPr>
+      <w:r>
+        <w:drawing>
+          <wp:inline xmlns:a="http://schemas.openxmlformats.org/drawingml/2006/main" xmlns:pic="http://schemas.openxmlformats.org/drawingml/2006/picture">
+            <wp:extent cx="3474720" cy="12552653"/>
+            <wp:docPr id="3" name="Picture 3"/>
+            <wp:cNvGraphicFramePr>
+              <a:graphicFrameLocks noChangeAspect="1"/>
+            </wp:cNvGraphicFramePr>
+            <a:graphic>
+              <a:graphicData uri="http://schemas.openxmlformats.org/drawingml/2006/picture">
+                <pic:pic>
+                  <pic:nvPicPr>
+                    <pic:cNvPr id="0" name="directory_structure.png"/>
+                    <pic:cNvPicPr/>
+                  </pic:nvPicPr>
+                  <pic:blipFill>
+                    <a:blip r:embed="rId11"/>
+                    <a:stretch>
+                      <a:fillRect/>
+                    </a:stretch>
+                  </pic:blipFill>
+                  <pic:spPr>
+                    <a:xfrm>
+                      <a:off x="0" y="0"/>
+                      <a:ext cx="3474720" cy="12552653"/>
+                    </a:xfrm>
+                    <a:prstGeom prst="rect"/>
+                  </pic:spPr>
+                </pic:pic>
+              </a:graphicData>
+            </a:graphic>
+          </wp:inline>
+        </w:drawing>
+      </w:r>
+    </w:p>
     <w:p>
       <w:r>
         <w:rPr>

</xml_diff>